<commit_message>
Conclusiones: viven en la plantilla, no en el README
Las conclusiones (párrafos 1 y 2) ahora van escritas dentro de cada DOCX
(positivo/negativo). El §4 deja de redactarlas: solo selecciona plantilla
por el umbral de 300 Bq/m³. Actualiza §2.3, §5, §9 y el ejemplo de §10
para reflejar que el agente no redacta conclusiones, solo elige plantilla.

Co-Authored-By: Claude Opus 4.8 (1M context) <noreply@anthropic.com>
</commit_message>
<xml_diff>
--- a/plantilla-informe-negativo.docx
+++ b/plantilla-informe-negativo.docx
@@ -257,6 +257,7 @@
           <w:rFonts w:ascii="Helvetica LT Std" w:hAnsi="Helvetica LT Std" w:cs="Calibri"/>
           <w:sz w:val="22"/>
         </w:rPr>
+        <w:lastRenderedPageBreak/>
         <w:t>El Pleno del Consejo de Seguridad Nuclear (CSN) aprobó el 9 de abril de 2025 la Instrucción IS-47 por la que se aprueba el listado de términos municipales de actuación prioritaria contra el radón, y se establecen las directrices para las mediciones de este gas radiactivo natural en el interior de los centros de trabajo. Esta instrucción requiere que los titulares de las actividades laborales que se desarrollen en lugares de trabajo situados en plantas bajas y plantas bajo rasante de los municipios de actuación prioritaria midan la concentración de radón en aire en todas las zonas en las que los trabajadores deban permanecer o a las que puedan acceder por razón de su trabajo, excluidas las zonas al aire libre.</w:t>
       </w:r>
     </w:p>
@@ -416,8 +417,15 @@
           <w:rFonts w:ascii="Helvetica LT Std" w:hAnsi="Helvetica LT Std" w:cs="Calibri"/>
           <w:sz w:val="22"/>
         </w:rPr>
+        <w:t xml:space="preserve">Este laboratorio está acreditado según la norma ISO 17025 y dispone además de certificación SWEDAC (equivalente a ENAC en España y válida en toda la Unión </w:t>
+      </w:r>
+      <w:r>
+        <w:rPr>
+          <w:rFonts w:ascii="Helvetica LT Std" w:hAnsi="Helvetica LT Std" w:cs="Calibri"/>
+          <w:sz w:val="22"/>
+        </w:rPr>
         <w:lastRenderedPageBreak/>
-        <w:t xml:space="preserve">Este laboratorio está acreditado según la norma ISO 17025 y dispone además de certificación SWEDAC (equivalente a ENAC en España y válida en toda la Unión Europea). El CSN reconoce a Radonova Laboratories AB como laboratorio acreditado en España para medir radón en aire. </w:t>
+        <w:t xml:space="preserve">Europea). El CSN reconoce a Radonova Laboratories AB como laboratorio acreditado en España para medir radón en aire. </w:t>
       </w:r>
     </w:p>
     <w:p>
@@ -623,6 +631,24 @@
           <w:rFonts w:ascii="Helvetica LT Std" w:hAnsi="Helvetica LT Std" w:cs="Arial"/>
         </w:rPr>
       </w:pPr>
+    </w:p>
+    <w:p>
+      <w:pPr>
+        <w:jc w:val="left"/>
+        <w:rPr>
+          <w:rFonts w:ascii="Helvetica LT Std" w:hAnsi="Helvetica LT Std" w:cs="Arial"/>
+          <w:b/>
+          <w:bCs/>
+        </w:rPr>
+      </w:pPr>
+      <w:r>
+        <w:rPr>
+          <w:rFonts w:ascii="Helvetica LT Std" w:hAnsi="Helvetica LT Std" w:cs="Arial"/>
+          <w:b/>
+          <w:bCs/>
+        </w:rPr>
+        <w:br w:type="page"/>
+      </w:r>
     </w:p>
     <w:p>
       <w:pPr>
@@ -692,10 +718,10 @@
         <w:tblLook w:val="04A0" w:firstRow="1" w:lastRow="0" w:firstColumn="1" w:lastColumn="0" w:noHBand="0" w:noVBand="1"/>
       </w:tblPr>
       <w:tblGrid>
-        <w:gridCol w:w="1728"/>
-        <w:gridCol w:w="2433"/>
-        <w:gridCol w:w="3063"/>
-        <w:gridCol w:w="1559"/>
+        <w:gridCol w:w="3148"/>
+        <w:gridCol w:w="1688"/>
+        <w:gridCol w:w="1848"/>
+        <w:gridCol w:w="3228"/>
       </w:tblGrid>
       <w:tr>
         <w:tc>
@@ -1063,20 +1089,81 @@
         <w:spacing w:line="360" w:lineRule="auto"/>
         <w:rPr>
           <w:rFonts w:ascii="Helvetica LT Std" w:hAnsi="Helvetica LT Std" w:cs="Calibri"/>
+          <w:sz w:val="22"/>
+        </w:rPr>
+      </w:pPr>
+      <w:r>
+        <w:rPr>
+          <w:rFonts w:ascii="Helvetica LT Std" w:hAnsi="Helvetica LT Std" w:cs="Calibri"/>
+          <w:sz w:val="22"/>
+        </w:rPr>
+        <w:t xml:space="preserve">Ninguna de las medidas tomadas en {UBICACION_CENTRO_CORTO} en {MUNICIPIO} supera la dosis máxima permitida ya que los resultados obtenidos en las mediciones, con periodos de exposición de detectores de 3 meses, todas las mediciones de valores de concentración de gas radón fueron inferiores a los 300 Bq/m³, establecidos como nivel de </w:t>
+      </w:r>
+      <w:r>
+        <w:rPr>
+          <w:rFonts w:ascii="Helvetica LT Std" w:hAnsi="Helvetica LT Std" w:cs="Calibri"/>
+          <w:sz w:val="22"/>
+        </w:rPr>
+        <w:lastRenderedPageBreak/>
+        <w:t>referencia por el Real Decreto 1029/2022 de 20 de diciembre de 2022 y por la Instrucción IS-47 del CSN.</w:t>
+      </w:r>
+    </w:p>
+    <w:p>
+      <w:pPr>
+        <w:pStyle w:val="BodyText"/>
+        <w:spacing w:line="360" w:lineRule="auto"/>
+        <w:rPr>
+          <w:rFonts w:ascii="Helvetica LT Std" w:hAnsi="Helvetica LT Std" w:cs="Calibri"/>
           <w:b/>
           <w:bCs/>
           <w:sz w:val="22"/>
         </w:rPr>
       </w:pPr>
+    </w:p>
+    <w:p>
+      <w:pPr>
+        <w:pStyle w:val="BodyText"/>
+        <w:spacing w:line="360" w:lineRule="auto"/>
+        <w:rPr>
+          <w:rFonts w:ascii="Helvetica LT Std" w:hAnsi="Helvetica LT Std" w:cs="Calibri"/>
+          <w:sz w:val="22"/>
+        </w:rPr>
+      </w:pPr>
       <w:r>
+        <w:rPr>
+          <w:rFonts w:ascii="Helvetica LT Std" w:hAnsi="Helvetica LT Std" w:cs="Calibri"/>
+          <w:sz w:val="22"/>
+        </w:rPr>
+        <w:t>El valor más alto registrado fue de {</w:t>
+      </w:r>
+      <w:proofErr w:type="spellStart"/>
+      <w:r>
+        <w:rPr>
+          <w:rFonts w:ascii="Helvetica LT Std" w:hAnsi="Helvetica LT Std" w:cs="Calibri"/>
+          <w:sz w:val="22"/>
+        </w:rPr>
+        <w:t>valor_maximo</w:t>
+      </w:r>
+      <w:proofErr w:type="spellEnd"/>
+      <w:r>
+        <w:rPr>
+          <w:rFonts w:ascii="Helvetica LT Std" w:hAnsi="Helvetica LT Std" w:cs="Calibri"/>
+          <w:sz w:val="22"/>
+        </w:rPr>
+        <w:t>}, muy por debajo del nivel de referencia de 300 Bq/m³. Por tanto, no se considera necesaria la adopción de medidas de remediación ni de protección radiológica adicionales en este centro de trabajo.</w:t>
+      </w:r>
+    </w:p>
+    <w:p>
+      <w:pPr>
+        <w:pStyle w:val="BodyText"/>
+        <w:spacing w:line="360" w:lineRule="auto"/>
         <w:rPr>
           <w:rFonts w:ascii="Helvetica LT Std" w:hAnsi="Helvetica LT Std" w:cs="Calibri"/>
           <w:b/>
           <w:bCs/>
           <w:sz w:val="22"/>
         </w:rPr>
-        <w:t>{CONCLUSION_PARRAFO_1}</w:t>
-      </w:r>
+      </w:pPr>
     </w:p>
     <w:p>
       <w:pPr>
@@ -1093,68 +1180,18 @@
     <w:p>
       <w:pPr>
         <w:pStyle w:val="BodyText"/>
-        <w:spacing w:line="360" w:lineRule="auto"/>
-        <w:rPr>
-          <w:rFonts w:ascii="Helvetica LT Std" w:hAnsi="Helvetica LT Std" w:cs="Calibri"/>
-          <w:b/>
-          <w:bCs/>
+        <w:spacing w:line="312" w:lineRule="auto"/>
+        <w:rPr>
+          <w:rFonts w:ascii="Helvetica LT Std" w:hAnsi="Helvetica LT Std" w:cs="Calibri"/>
           <w:sz w:val="22"/>
         </w:rPr>
       </w:pPr>
       <w:r>
         <w:rPr>
           <w:rFonts w:ascii="Helvetica LT Std" w:hAnsi="Helvetica LT Std" w:cs="Calibri"/>
-          <w:b/>
-          <w:bCs/>
-          <w:sz w:val="22"/>
-        </w:rPr>
-        <w:t>{CONCLUSION_PARRAFO_2}</w:t>
-      </w:r>
-    </w:p>
-    <w:p>
-      <w:pPr>
-        <w:pStyle w:val="BodyText"/>
-        <w:spacing w:line="360" w:lineRule="auto"/>
-        <w:rPr>
-          <w:rFonts w:ascii="Helvetica LT Std" w:hAnsi="Helvetica LT Std" w:cs="Calibri"/>
-          <w:b/>
-          <w:bCs/>
-          <w:sz w:val="22"/>
-        </w:rPr>
-      </w:pPr>
-    </w:p>
-    <w:p>
-      <w:pPr>
-        <w:pStyle w:val="BodyText"/>
-        <w:spacing w:line="360" w:lineRule="auto"/>
-        <w:rPr>
-          <w:rFonts w:ascii="Helvetica LT Std" w:hAnsi="Helvetica LT Std" w:cs="Calibri"/>
-          <w:sz w:val="22"/>
-        </w:rPr>
-      </w:pPr>
-      <w:r>
-        <w:rPr>
-          <w:rFonts w:ascii="Helvetica LT Std" w:hAnsi="Helvetica LT Std" w:cs="Calibri"/>
-          <w:sz w:val="22"/>
-        </w:rPr>
-        <w:t>HELENA HERNÁNDEZ MARTÍN</w:t>
-      </w:r>
-    </w:p>
-    <w:p>
-      <w:pPr>
-        <w:pStyle w:val="BodyText"/>
-        <w:spacing w:line="360" w:lineRule="auto"/>
-        <w:rPr>
-          <w:rFonts w:ascii="Helvetica LT Std" w:hAnsi="Helvetica LT Std" w:cs="Calibri"/>
-          <w:sz w:val="22"/>
-        </w:rPr>
-      </w:pPr>
-      <w:r>
-        <w:rPr>
-          <w:rFonts w:ascii="Helvetica LT Std" w:hAnsi="Helvetica LT Std" w:cs="Calibri"/>
-          <w:sz w:val="22"/>
-        </w:rPr>
-        <w:t>GRADUADA EN CIENCIAS AMBIENTALES</w:t>
+          <w:sz w:val="22"/>
+        </w:rPr>
+        <w:t>Helena Hernández Martín</w:t>
       </w:r>
     </w:p>
     <w:p>
@@ -1162,10 +1199,34 @@
         <w:pStyle w:val="BodyText"/>
         <w:spacing w:line="312" w:lineRule="auto"/>
         <w:rPr>
+          <w:rFonts w:ascii="Helvetica LT Std" w:hAnsi="Helvetica LT Std" w:cs="Calibri"/>
+          <w:sz w:val="22"/>
+        </w:rPr>
+      </w:pPr>
+      <w:r>
+        <w:rPr>
+          <w:rFonts w:ascii="Helvetica LT Std" w:hAnsi="Helvetica LT Std" w:cs="Calibri"/>
+          <w:sz w:val="22"/>
+        </w:rPr>
+        <w:t>Graduada en Ciencias Ambientales por la Universidad de Córdoba</w:t>
+      </w:r>
+    </w:p>
+    <w:p>
+      <w:pPr>
+        <w:pStyle w:val="BodyText"/>
+        <w:spacing w:line="312" w:lineRule="auto"/>
+        <w:rPr>
           <w:rFonts w:ascii="HelveticaNeueLT Std" w:hAnsi="HelveticaNeueLT Std" w:cs="Calibri"/>
           <w:sz w:val="22"/>
         </w:rPr>
       </w:pPr>
+      <w:r>
+        <w:rPr>
+          <w:rFonts w:ascii="Helvetica LT Std" w:hAnsi="Helvetica LT Std" w:cs="Calibri"/>
+          <w:sz w:val="22"/>
+        </w:rPr>
+        <w:t>Máster en Gestión Ambiental y Energética de las Organizaciones por la Universidad Europea</w:t>
+      </w:r>
     </w:p>
     <w:p>
       <w:pPr>
@@ -2143,7 +2204,7 @@
                                   <w:sz w:val="32"/>
                                   <w:szCs w:val="40"/>
                                 </w:rPr>
-                                <w:t xml:space="preserve">{TITULO_INFORME} </w:t>
+                                <w:t>{TITULO_INFORME}</w:t>
                               </w:r>
                             </w:sdtContent>
                           </w:sdt>
@@ -2250,7 +2311,7 @@
               <v:stroke joinstyle="miter"/>
               <v:path gradientshapeok="t" o:connecttype="rect"/>
             </v:shapetype>
-            <v:shape id="Cuadro de texto 11" o:spid="_x0000_s1026" type="#_x0000_t202" style="position:absolute;left:0;text-align:left;margin-left:97pt;margin-top:318.95pt;width:351.6pt;height:263.1pt;z-index:251666944;visibility:visible;mso-wrap-style:square;mso-width-percent:0;mso-height-percent:0;mso-wrap-distance-left:9pt;mso-wrap-distance-top:0;mso-wrap-distance-right:9pt;mso-wrap-distance-bottom:0;mso-position-horizontal:absolute;mso-position-horizontal-relative:margin;mso-position-vertical:absolute;mso-position-vertical-relative:text;mso-width-percent:0;mso-height-percent:0;mso-width-relative:page;mso-height-relative:page;v-text-anchor:top" o:gfxdata="UEsDBBQABgAIAAAAIQC2gziS/gAAAOEBAAATAAAAW0NvbnRlbnRfVHlwZXNdLnhtbJSRQU7DMBBF 90jcwfIWJU67QAgl6YK0S0CoHGBkTxKLZGx5TGhvj5O2G0SRWNoz/78nu9wcxkFMGNg6quQqL6RA 0s5Y6ir5vt9lD1JwBDIwOMJKHpHlpr69KfdHjyxSmriSfYz+USnWPY7AufNIadK6MEJMx9ApD/oD OlTrorhX2lFEilmcO2RdNtjC5xDF9pCuTyYBB5bi6bQ4syoJ3g9WQ0ymaiLzg5KdCXlKLjvcW893 SUOqXwnz5DrgnHtJTxOsQfEKIT7DmDSUCaxw7Rqn8787ZsmRM9e2VmPeBN4uqYvTtW7jvijg9N/y JsXecLq0q+WD6m8AAAD//wMAUEsDBBQABgAIAAAAIQA4/SH/1gAAAJQBAAALAAAAX3JlbHMvLnJl bHOkkMFqwzAMhu+DvYPRfXGawxijTi+j0GvpHsDYimMaW0Yy2fr2M4PBMnrbUb/Q94l/f/hMi1qR JVI2sOt6UJgd+ZiDgffL8ekFlFSbvV0oo4EbChzGx4f9GRdb25HMsYhqlCwG5lrLq9biZkxWOiqY 22YiTra2kYMu1l1tQD30/bPm3wwYN0x18gb45AdQl1tp5j/sFB2T0FQ7R0nTNEV3j6o9feQzro1i OWA14Fm+Q8a1a8+Bvu/d/dMb2JY5uiPbhG/ktn4cqGU/er3pcvwCAAD//wMAUEsDBBQABgAIAAAA IQDbpX454AEAAKIDAAAOAAAAZHJzL2Uyb0RvYy54bWysU9uO0zAQfUfiHyy/0zRtukDUdLXsahHS cpEWPsBx7MQi8Zix26R8PWOn2y3whnix7JnJmXPOTLbX09Czg0JvwFY8Xyw5U1ZCY2xb8W9f71+9 4cwHYRvRg1UVPyrPr3cvX2xHV6oVdNA3ChmBWF+OruJdCK7MMi87NQi/AKcsJTXgIAI9sc0aFCOh D322Wi6vshGwcQhSeU/RuznJdwlfayXDZ629CqyvOHEL6cR01vHMdltRtihcZ+SJhvgHFoMwlpqe oe5EEGyP5i+owUgEDzosJAwZaG2kShpITb78Q81jJ5xKWsgc7842+f8HKz8dHt0XZGF6BxMNMInw 7gHkd88s3HbCtuoGEcZOiYYa59GybHS+PH0arfaljyD1+BEaGrLYB0hAk8YhukI6GaHTAI5n09UU mKRgUVxt1itKScqt10W+2axSD1E+fe7Qh/cKBhYvFUeaaoIXhwcfIh1RPpXEbhbuTd+nyfb2twAV xkiiHxnP3MNUT1QdZdTQHEkIwrwotNh06QB/cjbSklTc/9gLVJz1HyyZ8TYvirhV6VFsXkcZeJmp LzPCSoKqeOBsvt6GeRP3Dk3bUafZfgs3ZKA2SdozqxNvWoSk+LS0cdMu36nq+dfa/QIAAP//AwBQ SwMEFAAGAAgAAAAhAKDB4vfkAAAAEQEAAA8AAABkcnMvZG93bnJldi54bWxMj81OwzAQhO9IvIO1 SNyonRLSJo1TISquIMqPxM2Nt0lEvI5itwlvz3KCy0qj2Z2dr9zOrhdnHEPnSUOyUCCQam87ajS8 vT7erEGEaMia3hNq+MYA2+ryojSF9RO94HkfG8EhFAqjoY1xKKQMdYvOhIUfkNg7+tGZyHJspB3N xOGul0ulMulMR/yhNQM+tFh/7U9Ow/vT8fMjVc/Nzt0Nk5+VJJdLra+v5t2Gx/0GRMQ5/l3ALwP3 h4qLHfyJbBA96zxloKghu13lIHhjna+WIA5sJVmagKxK+Z+k+gEAAP//AwBQSwECLQAUAAYACAAA ACEAtoM4kv4AAADhAQAAEwAAAAAAAAAAAAAAAAAAAAAAW0NvbnRlbnRfVHlwZXNdLnhtbFBLAQIt ABQABgAIAAAAIQA4/SH/1gAAAJQBAAALAAAAAAAAAAAAAAAAAC8BAABfcmVscy8ucmVsc1BLAQIt ABQABgAIAAAAIQDbpX454AEAAKIDAAAOAAAAAAAAAAAAAAAAAC4CAABkcnMvZTJvRG9jLnhtbFBL AQItABQABgAIAAAAIQCgweL35AAAABEBAAAPAAAAAAAAAAAAAAAAADoEAABkcnMvZG93bnJldi54 bWxQSwUGAAAAAAQABADzAAAASwUAAAAA " filled="f" stroked="f">
+            <v:shape id="Cuadro de texto 11" o:spid="_x0000_s1026" type="#_x0000_t202" style="position:absolute;left:0;text-align:left;margin-left:97pt;margin-top:318.95pt;width:351.6pt;height:263.1pt;z-index:251666944;visibility:visible;mso-wrap-style:square;mso-width-percent:0;mso-height-percent:0;mso-wrap-distance-left:9pt;mso-wrap-distance-top:0;mso-wrap-distance-right:9pt;mso-wrap-distance-bottom:0;mso-position-horizontal:absolute;mso-position-horizontal-relative:margin;mso-position-vertical:absolute;mso-position-vertical-relative:text;mso-width-percent:0;mso-height-percent:0;mso-width-relative:page;mso-height-relative:page;v-text-anchor:top" o:gfxdata="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" filled="f" stroked="f">
               <v:textbox>
                 <w:txbxContent>
                   <w:p>
@@ -2369,7 +2430,7 @@
                             <w:sz w:val="32"/>
                             <w:szCs w:val="40"/>
                           </w:rPr>
-                          <w:t xml:space="preserve">{TITULO_INFORME} </w:t>
+                          <w:t>{TITULO_INFORME}</w:t>
                         </w:r>
                       </w:sdtContent>
                     </w:sdt>
@@ -4461,7 +4522,7 @@
   <w:font w:name="Symbol">
     <w:panose1 w:val="05050102010706020507"/>
     <w:charset w:val="02"/>
-    <w:family w:val="decorative"/>
+    <w:family w:val="roman"/>
     <w:pitch w:val="variable"/>
     <w:sig w:usb0="00000000" w:usb1="10000000" w:usb2="00000000" w:usb3="00000000" w:csb0="80000000" w:csb1="00000000"/>
   </w:font>
@@ -4481,14 +4542,13 @@
   </w:font>
   <w:font w:name="Wingdings">
     <w:panose1 w:val="05000000000000000000"/>
-    <w:charset w:val="4D"/>
-    <w:family w:val="decorative"/>
+    <w:charset w:val="02"/>
+    <w:family w:val="auto"/>
     <w:pitch w:val="variable"/>
-    <w:sig w:usb0="00000003" w:usb1="00000000" w:usb2="00000000" w:usb3="00000000" w:csb0="80000001" w:csb1="00000000"/>
+    <w:sig w:usb0="00000000" w:usb1="10000000" w:usb2="00000000" w:usb3="00000000" w:csb0="80000000" w:csb1="00000000"/>
   </w:font>
   <w:font w:name="HelveticaNeueLT Std">
     <w:altName w:val="Arial"/>
-    <w:panose1 w:val="020B0604020202020204"/>
     <w:charset w:val="00"/>
     <w:family w:val="swiss"/>
     <w:pitch w:val="variable"/>
@@ -4517,7 +4577,6 @@
   </w:font>
   <w:font w:name="Helvetica LT Std">
     <w:altName w:val="Arial"/>
-    <w:panose1 w:val="00000000000000000000"/>
     <w:charset w:val="00"/>
     <w:family w:val="auto"/>
     <w:pitch w:val="variable"/>
@@ -4538,14 +4597,12 @@
     <w:sig w:usb0="E4002EFF" w:usb1="C200247B" w:usb2="00000009" w:usb3="00000000" w:csb0="000001FF" w:csb1="00000000"/>
   </w:font>
   <w:font w:name="Aptos">
-    <w:panose1 w:val="020B0004020202020204"/>
     <w:charset w:val="00"/>
     <w:family w:val="swiss"/>
     <w:pitch w:val="variable"/>
     <w:sig w:usb0="20000287" w:usb1="00000003" w:usb2="00000000" w:usb3="00000000" w:csb0="0000019F" w:csb1="00000000"/>
   </w:font>
   <w:font w:name="Aptos Display">
-    <w:panose1 w:val="020B0004020202020204"/>
     <w:charset w:val="00"/>
     <w:family w:val="swiss"/>
     <w:pitch w:val="variable"/>
@@ -4558,6 +4615,7 @@
 <w:settings xmlns:mc="http://schemas.openxmlformats.org/markup-compatibility/2006" xmlns:o="urn:schemas-microsoft-com:office:office" xmlns:r="http://schemas.openxmlformats.org/officeDocument/2006/relationships" xmlns:m="http://schemas.openxmlformats.org/officeDocument/2006/math" xmlns:v="urn:schemas-microsoft-com:vml" xmlns:w10="urn:schemas-microsoft-com:office:word" xmlns:w="http://schemas.openxmlformats.org/wordprocessingml/2006/main" xmlns:w14="http://schemas.microsoft.com/office/word/2010/wordml" xmlns:w15="http://schemas.microsoft.com/office/word/2012/wordml" xmlns:w16cex="http://schemas.microsoft.com/office/word/2018/wordml/cex" xmlns:w16cid="http://schemas.microsoft.com/office/word/2016/wordml/cid" xmlns:w16="http://schemas.microsoft.com/office/word/2018/wordml" xmlns:w16du="http://schemas.microsoft.com/office/word/2023/wordml/word16du" xmlns:w16sdtdh="http://schemas.microsoft.com/office/word/2020/wordml/sdtdatahash" xmlns:w16sdtfl="http://schemas.microsoft.com/office/word/2024/wordml/sdtformatlock" xmlns:w16se="http://schemas.microsoft.com/office/word/2015/wordml/symex" xmlns:sl="http://schemas.openxmlformats.org/schemaLibrary/2006/main" mc:Ignorable="w14 w15 w16se w16cid w16 w16cex w16sdtdh w16sdtfl w16du">
   <w:view w:val="normal"/>
   <w:defaultTabStop w:val="720"/>
+  <w:hyphenationZone w:val="425"/>
   <w:characterSpacingControl w:val="doNotCompress"/>
   <w:compat>
     <w:useFELayout/>
@@ -4570,8 +4628,10 @@
   </w:compat>
   <w:rsids>
     <w:rsidRoot w:val="008645FF"/>
+    <w:rsid w:val="002A144F"/>
     <w:rsid w:val="0033289E"/>
     <w:rsid w:val="008645FF"/>
+    <w:rsid w:val="00C610A1"/>
   </w:rsids>
   <m:mathPr>
     <m:mathFont m:val="Cambria Math"/>
@@ -4588,8 +4648,8 @@
   </m:mathPr>
   <w:themeFontLang w:val="en-CA"/>
   <w:clrSchemeMapping w:bg1="light1" w:t1="dark1" w:bg2="light2" w:t2="dark2" w:accent1="accent1" w:accent2="accent2" w:accent3="accent3" w:accent4="accent4" w:accent5="accent5" w:accent6="accent6" w:hyperlink="hyperlink" w:followedHyperlink="followedHyperlink"/>
-  <w:decimalSymbol w:val="."/>
-  <w:listSeparator w:val=","/>
+  <w:decimalSymbol w:val=","/>
+  <w:listSeparator w:val=";"/>
   <w15:chartTrackingRefBased/>
 </w:settings>
 </file>

</xml_diff>

<commit_message>
Cambios locales en plantillas antes de pull
Co-Authored-By: Claude Opus 4.8 (1M context) <noreply@anthropic.com>
</commit_message>
<xml_diff>
--- a/plantilla-informe-negativo.docx
+++ b/plantilla-informe-negativo.docx
@@ -156,7 +156,23 @@
           <w:rFonts w:ascii="Helvetica LT Std" w:hAnsi="Helvetica LT Std" w:cs="Calibri"/>
           <w:sz w:val="22"/>
         </w:rPr>
-        <w:t>Los territorios volcánicos canarios son considerados por el Consejo de Seguridad Nuclear (CSN) como «áreas identifcadas», por lo que requieren de especial atención pues pueden generar y favorecer la emisión de radiación ionizante producida por el radón. Por ello, las islas son consideradas de riesgo elevado.</w:t>
+        <w:t xml:space="preserve">Los territorios volcánicos canarios son considerados por el Consejo de Seguridad Nuclear (CSN) como «áreas </w:t>
+      </w:r>
+      <w:proofErr w:type="spellStart"/>
+      <w:r>
+        <w:rPr>
+          <w:rFonts w:ascii="Helvetica LT Std" w:hAnsi="Helvetica LT Std" w:cs="Calibri"/>
+          <w:sz w:val="22"/>
+        </w:rPr>
+        <w:t>identifcadas</w:t>
+      </w:r>
+      <w:proofErr w:type="spellEnd"/>
+      <w:r>
+        <w:rPr>
+          <w:rFonts w:ascii="Helvetica LT Std" w:hAnsi="Helvetica LT Std" w:cs="Calibri"/>
+          <w:sz w:val="22"/>
+        </w:rPr>
+        <w:t>», por lo que requieren de especial atención pues pueden generar y favorecer la emisión de radiación ionizante producida por el radón. Por ello, las islas son consideradas de riesgo elevado.</w:t>
       </w:r>
     </w:p>
     <w:p>
@@ -210,7 +226,23 @@
           <w:rFonts w:ascii="Helvetica LT Std" w:hAnsi="Helvetica LT Std" w:cs="Calibri"/>
           <w:sz w:val="22"/>
         </w:rPr>
-        <w:t>En el Real Decreto 1029/2022, de 20 de diciembre, se aprobó el reglamento sobre protección de la salud contra los riesgos derivados de la exposición a las radiaciones ionizantes, que establece en 300 Becquerelios /m3 la dosis máxima permitida y la obligatoriedad de realizar mediciones específicas en los puestos de trabajo, en concreto</w:t>
+        <w:t xml:space="preserve">En el Real Decreto 1029/2022, de 20 de diciembre, se aprobó el reglamento sobre protección de la salud contra los riesgos derivados de la exposición a las radiaciones ionizantes, que establece en 300 </w:t>
+      </w:r>
+      <w:proofErr w:type="spellStart"/>
+      <w:r>
+        <w:rPr>
+          <w:rFonts w:ascii="Helvetica LT Std" w:hAnsi="Helvetica LT Std" w:cs="Calibri"/>
+          <w:sz w:val="22"/>
+        </w:rPr>
+        <w:t>Becquerelios</w:t>
+      </w:r>
+      <w:proofErr w:type="spellEnd"/>
+      <w:r>
+        <w:rPr>
+          <w:rFonts w:ascii="Helvetica LT Std" w:hAnsi="Helvetica LT Std" w:cs="Calibri"/>
+          <w:sz w:val="22"/>
+        </w:rPr>
+        <w:t xml:space="preserve"> /m3 la dosis máxima permitida y la obligatoriedad de realizar mediciones específicas en los puestos de trabajo, en concreto</w:t>
       </w:r>
     </w:p>
     <w:p>
@@ -227,7 +259,23 @@
           <w:rFonts w:ascii="Helvetica LT Std" w:hAnsi="Helvetica LT Std" w:cs="Calibri"/>
           <w:sz w:val="22"/>
         </w:rPr>
-        <w:t>en el Capítulo I, artículo 2.2.c).3.º, establece la obligatoriedad de medir la exposición de trabajadores o miembros del público al radón en recintos cerrados.</w:t>
+        <w:t>en el Capítulo I, artículo 2.2.c</w:t>
+      </w:r>
+      <w:proofErr w:type="gramStart"/>
+      <w:r>
+        <w:rPr>
+          <w:rFonts w:ascii="Helvetica LT Std" w:hAnsi="Helvetica LT Std" w:cs="Calibri"/>
+          <w:sz w:val="22"/>
+        </w:rPr>
+        <w:t>).3.º</w:t>
+      </w:r>
+      <w:proofErr w:type="gramEnd"/>
+      <w:r>
+        <w:rPr>
+          <w:rFonts w:ascii="Helvetica LT Std" w:hAnsi="Helvetica LT Std" w:cs="Calibri"/>
+          <w:sz w:val="22"/>
+        </w:rPr>
+        <w:t>, establece la obligatoriedad de medir la exposición de trabajadores o miembros del público al radón en recintos cerrados.</w:t>
       </w:r>
     </w:p>
     <w:p>
@@ -428,18 +476,40 @@
           <w:rFonts w:ascii="Helvetica LT Std" w:hAnsi="Helvetica LT Std" w:cs="Calibri"/>
           <w:sz w:val="22"/>
         </w:rPr>
-        <w:t xml:space="preserve">Los detectores utilizados fueron los denominados Radtrak³©, proporcionados por el laboratorio acreditado según la norma ISO/IEC 17025, RADONOVA LABORATORIES AB ubicado en Södra Depagatan 2, 75 454 Uppsala, Suecia apara ser posteriormente analizados en su laboratorio para la determinación de los resultados. </w:t>
-      </w:r>
-    </w:p>
-    <w:p>
-      <w:pPr>
-        <w:pStyle w:val="BodyText"/>
-        <w:spacing w:line="360" w:lineRule="auto"/>
-        <w:rPr>
-          <w:rFonts w:ascii="Helvetica LT Std" w:hAnsi="Helvetica LT Std" w:cs="Calibri"/>
-          <w:sz w:val="22"/>
-        </w:rPr>
-      </w:pPr>
+        <w:t xml:space="preserve">Los detectores utilizados fueron los denominados Radtrak³©, proporcionados por el laboratorio acreditado según la norma ISO/IEC 17025, RADONOVA LABORATORIES AB ubicado en </w:t>
+      </w:r>
+      <w:proofErr w:type="spellStart"/>
+      <w:r>
+        <w:rPr>
+          <w:rFonts w:ascii="Helvetica LT Std" w:hAnsi="Helvetica LT Std" w:cs="Calibri"/>
+          <w:sz w:val="22"/>
+        </w:rPr>
+        <w:t>Södra</w:t>
+      </w:r>
+      <w:proofErr w:type="spellEnd"/>
+      <w:r>
+        <w:rPr>
+          <w:rFonts w:ascii="Helvetica LT Std" w:hAnsi="Helvetica LT Std" w:cs="Calibri"/>
+          <w:sz w:val="22"/>
+        </w:rPr>
+        <w:t xml:space="preserve"> </w:t>
+      </w:r>
+      <w:proofErr w:type="spellStart"/>
+      <w:r>
+        <w:rPr>
+          <w:rFonts w:ascii="Helvetica LT Std" w:hAnsi="Helvetica LT Std" w:cs="Calibri"/>
+          <w:sz w:val="22"/>
+        </w:rPr>
+        <w:t>Depagatan</w:t>
+      </w:r>
+      <w:proofErr w:type="spellEnd"/>
+      <w:r>
+        <w:rPr>
+          <w:rFonts w:ascii="Helvetica LT Std" w:hAnsi="Helvetica LT Std" w:cs="Calibri"/>
+          <w:sz w:val="22"/>
+        </w:rPr>
+        <w:t xml:space="preserve"> 2, 75 454 Uppsala, Suecia apara ser posteriormente analizados en su laboratorio para la determinación de los resultados. </w:t>
+      </w:r>
     </w:p>
     <w:p>
       <w:pPr>
@@ -461,7 +531,52 @@
           <w:sz w:val="22"/>
           <w:lang w:val="es-ES"/>
         </w:rPr>
-        <w:t>ESTUDIOS DEL TERRENO S.L. es el distribuidor oficial de RADONOVA LABORATORIES AB reconocido en España por el Consejo de Seguridad Nuclear (CSN) como laboratorio acreditado para medir radón en aire según la norma ISO/IEC 17025. (https://www.csn.es/radon).  La empresa Radonova Laboratories cuenta con la acreditación ISO 17025 por la entidad de acreditación sueca SWEDAC (equivalente a ENAC en España) con el numero 1489 para realizar medidas de la concentración de gas radón utilizando el método de medida de detectores de trazas. La acreditación SWEDAC está aceptada en todos los países de la CE a través del acuerdo EAL (Cooperación Europea para la Acreditación de Laboratorios)</w:t>
+        <w:lastRenderedPageBreak/>
+        <w:t xml:space="preserve">ESTUDIOS DEL TERRENO S.L. es el distribuidor oficial de RADONOVA LABORATORIES AB reconocido en España por el Consejo de Seguridad Nuclear (CSN) como laboratorio acreditado para medir radón en aire según la norma ISO/IEC 17025. (https://www.csn.es/radon).  La empresa </w:t>
+      </w:r>
+      <w:proofErr w:type="spellStart"/>
+      <w:r>
+        <w:rPr>
+          <w:rFonts w:ascii="Helvetica LT Std" w:hAnsi="Helvetica LT Std" w:cs="Calibri"/>
+          <w:b w:val="0"/>
+          <w:bCs w:val="0"/>
+          <w:sz w:val="22"/>
+          <w:lang w:val="es-ES"/>
+        </w:rPr>
+        <w:t>Radonova</w:t>
+      </w:r>
+      <w:proofErr w:type="spellEnd"/>
+      <w:r>
+        <w:rPr>
+          <w:rFonts w:ascii="Helvetica LT Std" w:hAnsi="Helvetica LT Std" w:cs="Calibri"/>
+          <w:b w:val="0"/>
+          <w:bCs w:val="0"/>
+          <w:sz w:val="22"/>
+          <w:lang w:val="es-ES"/>
+        </w:rPr>
+        <w:t xml:space="preserve"> </w:t>
+      </w:r>
+      <w:proofErr w:type="spellStart"/>
+      <w:r>
+        <w:rPr>
+          <w:rFonts w:ascii="Helvetica LT Std" w:hAnsi="Helvetica LT Std" w:cs="Calibri"/>
+          <w:b w:val="0"/>
+          <w:bCs w:val="0"/>
+          <w:sz w:val="22"/>
+          <w:lang w:val="es-ES"/>
+        </w:rPr>
+        <w:t>Laboratories</w:t>
+      </w:r>
+      <w:proofErr w:type="spellEnd"/>
+      <w:r>
+        <w:rPr>
+          <w:rFonts w:ascii="Helvetica LT Std" w:hAnsi="Helvetica LT Std" w:cs="Calibri"/>
+          <w:b w:val="0"/>
+          <w:bCs w:val="0"/>
+          <w:sz w:val="22"/>
+          <w:lang w:val="es-ES"/>
+        </w:rPr>
+        <w:t xml:space="preserve"> cuenta con la acreditación ISO 17025 por la entidad de acreditación sueca SWEDAC (equivalente a ENAC en España) con el numero 1489 para realizar medidas de la concentración de gas radón utilizando el método de medida de detectores de trazas. La acreditación SWEDAC está aceptada en todos los países de la CE a través del acuerdo EAL (Cooperación Europea para la Acreditación de Laboratorios)</w:t>
       </w:r>
       <w:r>
         <w:rPr>
@@ -691,7 +806,39 @@
           <w:rFonts w:ascii="Helvetica LT Std" w:hAnsi="Helvetica LT Std" w:cs="Calibri"/>
           <w:sz w:val="22"/>
         </w:rPr>
-        <w:t>Los resultados de los análisis de laboratorio proporcionados por Radonova Laboratories AB fueron los siguientes:</w:t>
+        <w:t xml:space="preserve">Los resultados de los análisis de laboratorio proporcionados por </w:t>
+      </w:r>
+      <w:proofErr w:type="spellStart"/>
+      <w:r>
+        <w:rPr>
+          <w:rFonts w:ascii="Helvetica LT Std" w:hAnsi="Helvetica LT Std" w:cs="Calibri"/>
+          <w:sz w:val="22"/>
+        </w:rPr>
+        <w:t>Radonova</w:t>
+      </w:r>
+      <w:proofErr w:type="spellEnd"/>
+      <w:r>
+        <w:rPr>
+          <w:rFonts w:ascii="Helvetica LT Std" w:hAnsi="Helvetica LT Std" w:cs="Calibri"/>
+          <w:sz w:val="22"/>
+        </w:rPr>
+        <w:t xml:space="preserve"> </w:t>
+      </w:r>
+      <w:proofErr w:type="spellStart"/>
+      <w:r>
+        <w:rPr>
+          <w:rFonts w:ascii="Helvetica LT Std" w:hAnsi="Helvetica LT Std" w:cs="Calibri"/>
+          <w:sz w:val="22"/>
+        </w:rPr>
+        <w:t>Laboratories</w:t>
+      </w:r>
+      <w:proofErr w:type="spellEnd"/>
+      <w:r>
+        <w:rPr>
+          <w:rFonts w:ascii="Helvetica LT Std" w:hAnsi="Helvetica LT Std" w:cs="Calibri"/>
+          <w:sz w:val="22"/>
+        </w:rPr>
+        <w:t xml:space="preserve"> AB fueron los siguientes:</w:t>
       </w:r>
     </w:p>
     <w:p>
@@ -705,7 +852,7 @@
     </w:p>
     <w:tbl>
       <w:tblPr>
-        <w:tblW w:w="9275" w:type="dxa"/>
+        <w:tblW w:w="8926" w:type="dxa"/>
         <w:tblBorders>
           <w:top w:val="single" w:sz="4" w:space="0" w:color="auto"/>
           <w:left w:val="single" w:sz="4" w:space="0" w:color="auto"/>
@@ -714,13 +861,14 @@
           <w:insideH w:val="single" w:sz="4" w:space="0" w:color="auto"/>
           <w:insideV w:val="single" w:sz="4" w:space="0" w:color="auto"/>
         </w:tblBorders>
+        <w:tblLayout w:type="fixed"/>
         <w:tblLook w:val="04A0" w:firstRow="1" w:lastRow="0" w:firstColumn="1" w:lastColumn="0" w:noHBand="0" w:noVBand="1"/>
       </w:tblPr>
       <w:tblGrid>
-        <w:gridCol w:w="3148"/>
-        <w:gridCol w:w="1688"/>
-        <w:gridCol w:w="1848"/>
-        <w:gridCol w:w="3228"/>
+        <w:gridCol w:w="2122"/>
+        <w:gridCol w:w="1984"/>
+        <w:gridCol w:w="1985"/>
+        <w:gridCol w:w="2835"/>
       </w:tblGrid>
       <w:tr>
         <w:trPr>
@@ -728,7 +876,7 @@
         </w:trPr>
         <w:tc>
           <w:tcPr>
-            <w:tcW w:w="2946" w:type="dxa"/>
+            <w:tcW w:w="2122" w:type="dxa"/>
             <w:vAlign w:val="center"/>
           </w:tcPr>
           <w:p>
@@ -758,7 +906,7 @@
         </w:tc>
         <w:tc>
           <w:tcPr>
-            <w:tcW w:w="1579" w:type="dxa"/>
+            <w:tcW w:w="1984" w:type="dxa"/>
             <w:vAlign w:val="center"/>
           </w:tcPr>
           <w:p>
@@ -788,7 +936,7 @@
         </w:tc>
         <w:tc>
           <w:tcPr>
-            <w:tcW w:w="1729" w:type="dxa"/>
+            <w:tcW w:w="1985" w:type="dxa"/>
             <w:vAlign w:val="center"/>
           </w:tcPr>
           <w:p>
@@ -818,7 +966,7 @@
         </w:tc>
         <w:tc>
           <w:tcPr>
-            <w:tcW w:w="3021" w:type="dxa"/>
+            <w:tcW w:w="2835" w:type="dxa"/>
             <w:vAlign w:val="center"/>
           </w:tcPr>
           <w:p>
@@ -853,7 +1001,7 @@
         </w:trPr>
         <w:tc>
           <w:tcPr>
-            <w:tcW w:w="2946" w:type="dxa"/>
+            <w:tcW w:w="2122" w:type="dxa"/>
             <w:vAlign w:val="center"/>
           </w:tcPr>
           <w:p>
@@ -878,13 +1026,35 @@
                 <w:sz w:val="18"/>
                 <w:szCs w:val="18"/>
               </w:rPr>
-              <w:t>{#DETECTORES}{detector_numero} [Radtrak³®]</w:t>
+              <w:t>{#</w:t>
+            </w:r>
+            <w:proofErr w:type="gramStart"/>
+            <w:r>
+              <w:rPr>
+                <w:rFonts w:ascii="Helvetica LT Std" w:hAnsi="Helvetica LT Std"/>
+                <w:i/>
+                <w:iCs/>
+                <w:sz w:val="18"/>
+                <w:szCs w:val="18"/>
+              </w:rPr>
+              <w:t>DETECTORES}{</w:t>
+            </w:r>
+            <w:proofErr w:type="gramEnd"/>
+            <w:r>
+              <w:rPr>
+                <w:rFonts w:ascii="Helvetica LT Std" w:hAnsi="Helvetica LT Std"/>
+                <w:i/>
+                <w:iCs/>
+                <w:sz w:val="18"/>
+                <w:szCs w:val="18"/>
+              </w:rPr>
+              <w:t>detector_numero} [Radtrak³®]</w:t>
             </w:r>
           </w:p>
         </w:tc>
         <w:tc>
           <w:tcPr>
-            <w:tcW w:w="1579" w:type="dxa"/>
+            <w:tcW w:w="1984" w:type="dxa"/>
             <w:vAlign w:val="center"/>
           </w:tcPr>
           <w:p>
@@ -907,13 +1077,35 @@
                 <w:szCs w:val="18"/>
                 <w:lang w:val="es-ES_tradnl"/>
               </w:rPr>
-              <w:t>{detector_periodo}</w:t>
+              <w:t>{</w:t>
+            </w:r>
+            <w:proofErr w:type="spellStart"/>
+            <w:r>
+              <w:rPr>
+                <w:rFonts w:ascii="Helvetica LT Std" w:hAnsi="Helvetica LT Std" w:cs="Calibri"/>
+                <w:color w:val="3B3838"/>
+                <w:sz w:val="18"/>
+                <w:szCs w:val="18"/>
+                <w:lang w:val="es-ES_tradnl"/>
+              </w:rPr>
+              <w:t>detector_periodo</w:t>
+            </w:r>
+            <w:proofErr w:type="spellEnd"/>
+            <w:r>
+              <w:rPr>
+                <w:rFonts w:ascii="Helvetica LT Std" w:hAnsi="Helvetica LT Std" w:cs="Calibri"/>
+                <w:color w:val="3B3838"/>
+                <w:sz w:val="18"/>
+                <w:szCs w:val="18"/>
+                <w:lang w:val="es-ES_tradnl"/>
+              </w:rPr>
+              <w:t>}</w:t>
             </w:r>
           </w:p>
         </w:tc>
         <w:tc>
           <w:tcPr>
-            <w:tcW w:w="1729" w:type="dxa"/>
+            <w:tcW w:w="1985" w:type="dxa"/>
             <w:vAlign w:val="center"/>
           </w:tcPr>
           <w:p>
@@ -936,13 +1128,35 @@
                 <w:szCs w:val="18"/>
                 <w:lang w:val="es-ES_tradnl"/>
               </w:rPr>
-              <w:t>{detector_ubicacion}</w:t>
+              <w:t>{</w:t>
+            </w:r>
+            <w:proofErr w:type="spellStart"/>
+            <w:r>
+              <w:rPr>
+                <w:rFonts w:ascii="Helvetica LT Std" w:hAnsi="Helvetica LT Std" w:cs="Calibri"/>
+                <w:color w:val="3B3838"/>
+                <w:sz w:val="18"/>
+                <w:szCs w:val="18"/>
+                <w:lang w:val="es-ES_tradnl"/>
+              </w:rPr>
+              <w:t>detector_ubicacion</w:t>
+            </w:r>
+            <w:proofErr w:type="spellEnd"/>
+            <w:r>
+              <w:rPr>
+                <w:rFonts w:ascii="Helvetica LT Std" w:hAnsi="Helvetica LT Std" w:cs="Calibri"/>
+                <w:color w:val="3B3838"/>
+                <w:sz w:val="18"/>
+                <w:szCs w:val="18"/>
+                <w:lang w:val="es-ES_tradnl"/>
+              </w:rPr>
+              <w:t>}</w:t>
             </w:r>
           </w:p>
         </w:tc>
         <w:tc>
           <w:tcPr>
-            <w:tcW w:w="3021" w:type="dxa"/>
+            <w:tcW w:w="2835" w:type="dxa"/>
             <w:vAlign w:val="center"/>
           </w:tcPr>
           <w:p>
@@ -965,7 +1179,43 @@
                 <w:sz w:val="18"/>
                 <w:szCs w:val="18"/>
               </w:rPr>
-              <w:t>{detector_resultado}{/DETECTORES}</w:t>
+              <w:t>{</w:t>
+            </w:r>
+            <w:proofErr w:type="spellStart"/>
+            <w:r>
+              <w:rPr>
+                <w:rFonts w:ascii="Helvetica LT Std" w:hAnsi="Helvetica LT Std"/>
+                <w:sz w:val="18"/>
+                <w:szCs w:val="18"/>
+              </w:rPr>
+              <w:t>detector_</w:t>
+            </w:r>
+            <w:proofErr w:type="gramStart"/>
+            <w:r>
+              <w:rPr>
+                <w:rFonts w:ascii="Helvetica LT Std" w:hAnsi="Helvetica LT Std"/>
+                <w:sz w:val="18"/>
+                <w:szCs w:val="18"/>
+              </w:rPr>
+              <w:t>resultado</w:t>
+            </w:r>
+            <w:proofErr w:type="spellEnd"/>
+            <w:r>
+              <w:rPr>
+                <w:rFonts w:ascii="Helvetica LT Std" w:hAnsi="Helvetica LT Std"/>
+                <w:sz w:val="18"/>
+                <w:szCs w:val="18"/>
+              </w:rPr>
+              <w:t>}{</w:t>
+            </w:r>
+            <w:proofErr w:type="gramEnd"/>
+            <w:r>
+              <w:rPr>
+                <w:rFonts w:ascii="Helvetica LT Std" w:hAnsi="Helvetica LT Std"/>
+                <w:sz w:val="18"/>
+                <w:szCs w:val="18"/>
+              </w:rPr>
+              <w:t>/DETECTORES}</w:t>
             </w:r>
           </w:p>
         </w:tc>
@@ -1090,7 +1340,23 @@
           <w:rFonts w:ascii="Helvetica LT Std" w:hAnsi="Helvetica LT Std" w:cs="Calibri"/>
           <w:sz w:val="22"/>
         </w:rPr>
-        <w:t xml:space="preserve">En los lugares de trabajo en los que  la concentración de radón supera el nivel de referencia, la instrucción IS-33 del Consejo de Seguridad Nuclear requiere que se haga una estimación anual de las dosis efectivas individuales de las dosis recibidas por los trabajadores. </w:t>
+        <w:t xml:space="preserve">En los lugares de trabajo en los </w:t>
+      </w:r>
+      <w:proofErr w:type="gramStart"/>
+      <w:r>
+        <w:rPr>
+          <w:rFonts w:ascii="Helvetica LT Std" w:hAnsi="Helvetica LT Std" w:cs="Calibri"/>
+          <w:sz w:val="22"/>
+        </w:rPr>
+        <w:t>que  la</w:t>
+      </w:r>
+      <w:proofErr w:type="gramEnd"/>
+      <w:r>
+        <w:rPr>
+          <w:rFonts w:ascii="Helvetica LT Std" w:hAnsi="Helvetica LT Std" w:cs="Calibri"/>
+          <w:sz w:val="22"/>
+        </w:rPr>
+        <w:t xml:space="preserve"> concentración de radón supera el nivel de referencia, la instrucción IS-33 del Consejo de Seguridad Nuclear requiere que se haga una estimación anual de las dosis efectivas individuales de las dosis recibidas por los trabajadores. </w:t>
       </w:r>
     </w:p>
     <w:p>
@@ -1146,7 +1412,23 @@
           <w:rFonts w:ascii="Helvetica LT Std" w:hAnsi="Helvetica LT Std" w:cs="Calibri"/>
           <w:sz w:val="22"/>
         </w:rPr>
-        <w:t>El valor más alto registrado fue de {valor_maximo}, muy por debajo del nivel de referencia de 300 Bq/m³. Por tanto, no se considera necesaria la adopción de medidas de remediación ni de protección radiológica adicionales en este centro de trabajo.</w:t>
+        <w:t>El valor más alto registrado fue de {</w:t>
+      </w:r>
+      <w:proofErr w:type="spellStart"/>
+      <w:r>
+        <w:rPr>
+          <w:rFonts w:ascii="Helvetica LT Std" w:hAnsi="Helvetica LT Std" w:cs="Calibri"/>
+          <w:sz w:val="22"/>
+        </w:rPr>
+        <w:t>valor_maximo</w:t>
+      </w:r>
+      <w:proofErr w:type="spellEnd"/>
+      <w:r>
+        <w:rPr>
+          <w:rFonts w:ascii="Helvetica LT Std" w:hAnsi="Helvetica LT Std" w:cs="Calibri"/>
+          <w:sz w:val="22"/>
+        </w:rPr>
+        <w:t>}, muy por debajo del nivel de referencia de 300 Bq/m³. Por tanto, no se considera necesaria la adopción de medidas de remediación ni de protección radiológica adicionales en este centro de trabajo.</w:t>
       </w:r>
     </w:p>
     <w:p>
@@ -4824,7 +5106,9 @@
     <w:rsid w:val="00C610A1"/>
     <w:rsid w:val="00DC3FFB"/>
     <w:rsid w:val="00DD0D28"/>
+    <w:rsid w:val="00E5450E"/>
     <w:rsid w:val="00E61167"/>
+    <w:rsid w:val="00F309C3"/>
   </w:rsids>
   <m:mathPr>
     <m:mathFont m:val="Cambria Math"/>

</xml_diff>